<commit_message>
Add Office temporary .docx files
Adds two binary .docx files under Florian/: "Florian/~$cument complémentair1.docx" and "Florian/~$ossaire Bisoly.docx" (new files, mode 100644). These appear to be Microsoft Office temporary/lock files (names begin with '~$'). If these were added unintentionally, remove them and add a .gitignore rule (e.g. ~$*.docx) to prevent committing Office temp files in the future.
</commit_message>
<xml_diff>
--- a/Florian/Glossaire Bisoly.docx
+++ b/Florian/Glossaire Bisoly.docx
@@ -7,7 +7,15 @@
         <w:pStyle w:val="Style"/>
       </w:pPr>
       <w:r>
-        <w:t xml:space="preserve">Glossaire Bisoly </w:t>
+        <w:t xml:space="preserve">Glossaire </w:t>
+      </w:r>
+      <w:proofErr w:type="spellStart"/>
+      <w:r>
+        <w:t>Bisoly</w:t>
+      </w:r>
+      <w:proofErr w:type="spellEnd"/>
+      <w:r>
+        <w:t xml:space="preserve"> </w:t>
       </w:r>
     </w:p>
     <w:p/>
@@ -59,7 +67,35 @@
           <w:lang w:eastAsia="fr-FR"/>
         </w:rPr>
         <w:br/>
-        <w:t>On y voit les acteurs (personnes ou systèmes externes) et les cas d’utilisation (fonctionnalités : « gérer les gabarits », « consulter les informations », etc.), avec des relations entre eux (include, extend).</w:t>
+        <w:t>On y voit les acteurs (personnes ou systèmes externes) et les cas d’utilisation (fonctionnalités : « gérer les gabarits », « consulter les informations », etc.), avec des relations entre eux (</w:t>
+      </w:r>
+      <w:proofErr w:type="spellStart"/>
+      <w:r>
+        <w:rPr>
+          <w:lang w:eastAsia="fr-FR"/>
+        </w:rPr>
+        <w:t>include</w:t>
+      </w:r>
+      <w:proofErr w:type="spellEnd"/>
+      <w:r>
+        <w:rPr>
+          <w:lang w:eastAsia="fr-FR"/>
+        </w:rPr>
+        <w:t xml:space="preserve">, </w:t>
+      </w:r>
+      <w:proofErr w:type="spellStart"/>
+      <w:r>
+        <w:rPr>
+          <w:lang w:eastAsia="fr-FR"/>
+        </w:rPr>
+        <w:t>extend</w:t>
+      </w:r>
+      <w:proofErr w:type="spellEnd"/>
+      <w:r>
+        <w:rPr>
+          <w:lang w:eastAsia="fr-FR"/>
+        </w:rPr>
+        <w:t>).</w:t>
       </w:r>
     </w:p>
     <w:p>
@@ -162,7 +198,23 @@
       </w:r>
       <w:r>
         <w:br/>
-        <w:t>Il présente les classes (Utilisateur, Gabarit, Contenu, RaspberryPi), leurs attributs (id, login, contenuHTML…) et leurs méthodes</w:t>
+        <w:t xml:space="preserve">Il présente les classes (Utilisateur, Gabarit, Contenu, </w:t>
+      </w:r>
+      <w:proofErr w:type="spellStart"/>
+      <w:r>
+        <w:t>RaspberryPi</w:t>
+      </w:r>
+      <w:proofErr w:type="spellEnd"/>
+      <w:r>
+        <w:t xml:space="preserve">), leurs attributs (id, login, </w:t>
+      </w:r>
+      <w:proofErr w:type="spellStart"/>
+      <w:r>
+        <w:t>contenuHTML</w:t>
+      </w:r>
+      <w:proofErr w:type="spellEnd"/>
+      <w:r>
+        <w:t>…) et leurs méthodes</w:t>
       </w:r>
     </w:p>
     <w:p>
@@ -265,12 +317,37 @@
           <w:lang w:eastAsia="fr-FR"/>
         </w:rPr>
       </w:pPr>
+      <w:proofErr w:type="spellStart"/>
       <w:r>
         <w:rPr>
           <w:b/>
           <w:bCs/>
         </w:rPr>
-        <w:t>Include (&lt;&lt;include&gt;&gt;)</w:t>
+        <w:t>Include</w:t>
+      </w:r>
+      <w:proofErr w:type="spellEnd"/>
+      <w:r>
+        <w:rPr>
+          <w:b/>
+          <w:bCs/>
+        </w:rPr>
+        <w:t xml:space="preserve"> (&lt;&lt;</w:t>
+      </w:r>
+      <w:proofErr w:type="spellStart"/>
+      <w:r>
+        <w:rPr>
+          <w:b/>
+          <w:bCs/>
+        </w:rPr>
+        <w:t>include</w:t>
+      </w:r>
+      <w:proofErr w:type="spellEnd"/>
+      <w:r>
+        <w:rPr>
+          <w:b/>
+          <w:bCs/>
+        </w:rPr>
+        <w:t>&gt;&gt;)</w:t>
       </w:r>
       <w:r>
         <w:rPr>
@@ -311,12 +388,37 @@
           <w:lang w:eastAsia="fr-FR"/>
         </w:rPr>
       </w:pPr>
+      <w:proofErr w:type="spellStart"/>
       <w:r>
         <w:rPr>
           <w:b/>
           <w:bCs/>
         </w:rPr>
-        <w:t>Extend (&lt;&lt;extend&gt;&gt;)</w:t>
+        <w:t>Extend</w:t>
+      </w:r>
+      <w:proofErr w:type="spellEnd"/>
+      <w:r>
+        <w:rPr>
+          <w:b/>
+          <w:bCs/>
+        </w:rPr>
+        <w:t xml:space="preserve"> (&lt;&lt;</w:t>
+      </w:r>
+      <w:proofErr w:type="spellStart"/>
+      <w:r>
+        <w:rPr>
+          <w:b/>
+          <w:bCs/>
+        </w:rPr>
+        <w:t>extend</w:t>
+      </w:r>
+      <w:proofErr w:type="spellEnd"/>
+      <w:r>
+        <w:rPr>
+          <w:b/>
+          <w:bCs/>
+        </w:rPr>
+        <w:t>&gt;&gt;)</w:t>
       </w:r>
       <w:r>
         <w:rPr>
@@ -345,6 +447,19 @@
           <w:lang w:eastAsia="fr-FR"/>
         </w:rPr>
         <w:t xml:space="preserve">Il est en flèche pleine  </w:t>
+      </w:r>
+    </w:p>
+    <w:p>
+      <w:r>
+        <w:t xml:space="preserve">Fa : Fast </w:t>
+      </w:r>
+      <w:proofErr w:type="spellStart"/>
+      <w:r>
+        <w:t>ethernet</w:t>
+      </w:r>
+      <w:proofErr w:type="spellEnd"/>
+      <w:r>
+        <w:t xml:space="preserve"> dans notre cas la fibre </w:t>
       </w:r>
     </w:p>
     <w:p/>

</xml_diff>